<commit_message>
docs: dołącz plan gotowości RODO w .docx (dane administratora TD)
Wersja Word planu gotowości RODO z realnymi danymi administratora
(Teatr Dramatyczny im. Gustawa Holoubka: NIP 525-25-44-475, REGON 146463327,
IOD iod@teatrdramatyczny.pl). Generowany z docs/RODO-gotowosc.md.

Co-Authored-By: Claude Opus 4.8 <noreply@anthropic.com>
</commit_message>
<xml_diff>
--- a/docs/RODO-gotowosc.docx
+++ b/docs/RODO-gotowosc.docx
@@ -39,7 +39,7 @@
           <w:sz w:val="18"/>
           <w:szCs w:val="18"/>
         </w:rPr>
-        <w:t xml:space="preserve">Dokument roboczy dla przeglądu prawnika / IOD · wersja 2026-07-05</w:t>
+        <w:t xml:space="preserve">Dokument roboczy dla przeglądu prawnika / IOD · wersja 2026-07-06</w:t>
       </w:r>
     </w:p>
     <w:tbl>
@@ -87,6 +87,167 @@
         </w:tc>
       </w:tr>
     </w:tbl>
+    <w:p>
+      <w:pPr>
+        <w:spacing w:after="120"/>
+      </w:pPr>
+    </w:p>
+    <w:p>
+      <w:pPr>
+        <w:pStyle w:val="Heading2"/>
+      </w:pPr>
+      <w:r>
+        <w:t xml:space="preserve">Administrator danych (Teatr Dramatyczny)</w:t>
+      </w:r>
+    </w:p>
+    <w:p>
+      <w:pPr>
+        <w:pStyle w:val="ListParagraph"/>
+        <w:numPr>
+          <w:ilvl w:val="0"/>
+          <w:numId w:val="2"/>
+        </w:numPr>
+        <w:spacing w:after="60"/>
+      </w:pPr>
+      <w:r>
+        <w:rPr>
+          <w:b/>
+          <w:bCs/>
+        </w:rPr>
+        <w:t xml:space="preserve">Administrator: </w:t>
+      </w:r>
+      <w:r>
+        <w:t xml:space="preserve">Teatr Dramatyczny im. Gustawa Holoubka</w:t>
+      </w:r>
+    </w:p>
+    <w:p>
+      <w:pPr>
+        <w:pStyle w:val="ListParagraph"/>
+        <w:numPr>
+          <w:ilvl w:val="0"/>
+          <w:numId w:val="2"/>
+        </w:numPr>
+        <w:spacing w:after="60"/>
+      </w:pPr>
+      <w:r>
+        <w:rPr>
+          <w:b/>
+          <w:bCs/>
+        </w:rPr>
+        <w:t xml:space="preserve">Siedziba: </w:t>
+      </w:r>
+      <w:r>
+        <w:t xml:space="preserve">Pałac Kultury i Nauki, pl. Defilad 1, 00-901 Warszawa</w:t>
+      </w:r>
+    </w:p>
+    <w:p>
+      <w:pPr>
+        <w:pStyle w:val="ListParagraph"/>
+        <w:numPr>
+          <w:ilvl w:val="0"/>
+          <w:numId w:val="2"/>
+        </w:numPr>
+        <w:spacing w:after="60"/>
+      </w:pPr>
+      <w:r>
+        <w:rPr>
+          <w:b/>
+          <w:bCs/>
+        </w:rPr>
+        <w:t xml:space="preserve">NIP: </w:t>
+      </w:r>
+      <w:r>
+        <w:t xml:space="preserve">525-25-44-475</w:t>
+      </w:r>
+      <w:r>
+        <w:t xml:space="preserve">   ·   </w:t>
+      </w:r>
+      <w:r>
+        <w:rPr>
+          <w:b/>
+          <w:bCs/>
+        </w:rPr>
+        <w:t xml:space="preserve">REGON: </w:t>
+      </w:r>
+      <w:r>
+        <w:t xml:space="preserve">146463327</w:t>
+      </w:r>
+    </w:p>
+    <w:p>
+      <w:pPr>
+        <w:pStyle w:val="ListParagraph"/>
+        <w:numPr>
+          <w:ilvl w:val="0"/>
+          <w:numId w:val="2"/>
+        </w:numPr>
+        <w:spacing w:after="60"/>
+      </w:pPr>
+      <w:r>
+        <w:rPr>
+          <w:b/>
+          <w:bCs/>
+        </w:rPr>
+        <w:t xml:space="preserve">Rejestr: </w:t>
+      </w:r>
+      <w:r>
+        <w:t xml:space="preserve">RIA/1/2013 — Rejestr Instytucji Kultury m.st. Warszawy</w:t>
+      </w:r>
+    </w:p>
+    <w:p>
+      <w:pPr>
+        <w:pStyle w:val="ListParagraph"/>
+        <w:numPr>
+          <w:ilvl w:val="0"/>
+          <w:numId w:val="2"/>
+        </w:numPr>
+        <w:spacing w:after="60"/>
+      </w:pPr>
+      <w:r>
+        <w:rPr>
+          <w:b/>
+          <w:bCs/>
+        </w:rPr>
+        <w:t xml:space="preserve">Kontakt: </w:t>
+      </w:r>
+      <w:r>
+        <w:t xml:space="preserve">kontakt@teatrdramatyczny.pl · tel. 721 223 372 (Biuro Obsługi Widzów)</w:t>
+      </w:r>
+    </w:p>
+    <w:p>
+      <w:pPr>
+        <w:pStyle w:val="ListParagraph"/>
+        <w:numPr>
+          <w:ilvl w:val="0"/>
+          <w:numId w:val="2"/>
+        </w:numPr>
+        <w:spacing w:after="60"/>
+      </w:pPr>
+      <w:r>
+        <w:rPr>
+          <w:b/>
+          <w:bCs/>
+        </w:rPr>
+        <w:t xml:space="preserve">Inspektor Ochrony Danych (IOD): </w:t>
+      </w:r>
+      <w:r>
+        <w:t xml:space="preserve">iod@teatrdramatyczny.pl</w:t>
+      </w:r>
+    </w:p>
+    <w:p>
+      <w:pPr>
+        <w:spacing w:after="120"/>
+      </w:pPr>
+      <w:r>
+        <w:rPr>
+          <w:i/>
+          <w:iCs/>
+          <w:color w:val="777777"/>
+          <w:sz w:val="17"/>
+          <w:szCs w:val="17"/>
+        </w:rPr>
+        <w:t xml:space="preserve">Źródło: teatrdramatyczny.pl/kontakt oraz /rodo (stan 2026-07-06). Administrator w swojej polityce deklaruje brak przekazywania danych poza EOG — patrz §4.</w:t>
+      </w:r>
+    </w:p>
     <w:p>
       <w:pPr>
         <w:spacing w:after="120"/>
@@ -2404,6 +2565,21 @@
       </w:r>
       <w:r>
         <w:t xml:space="preserve">potwierdzić region bazy = UE; zebrać DPA/SCC każdego dostawcy; sporządzić listę subprocesorów jako załącznik do umowy powierzenia; dla dostawcy AI potwierdzić brak retencji/treningu.</w:t>
+      </w:r>
+    </w:p>
+    <w:p>
+      <w:pPr>
+        <w:spacing w:after="120"/>
+      </w:pPr>
+      <w:r>
+        <w:rPr>
+          <w:b/>
+          <w:bCs/>
+        </w:rPr>
+        <w:t xml:space="preserve">Uwaga (Teatr Dramatyczny): </w:t>
+      </w:r>
+      <w:r>
+        <w:t xml:space="preserve">administrator w swojej polityce prywatności deklaruje brak przekazywania danych poza EOG. Dobór dostawców usług dla tej aplikacji musi to zapewniać (regiony UE) albo klauzula informacyjna/umowa muszą tę kwestię jawnie uregulować.</w:t>
       </w:r>
     </w:p>
     <w:p>

</xml_diff>